<commit_message>
Update instructions to safely pull latest code and restart application
Implement git reset --hard origin/main to resolve pull conflicts and ensure latest code is applied.

Replit-Commit-Author: Agent
Replit-Commit-Session-Id: ed7474f6-eba3-49be-ae95-2623f31fe374
Replit-Commit-Checkpoint-Type: full_checkpoint
Replit-Commit-Event-Id: 29198b3a-6991-499d-8bb8-ac662448cd00
Replit-Commit-Screenshot-Url: https://storage.googleapis.com/screenshot-production-us-central1/9eca0e28-34a0-4418-9f5c-60e618813417/ed7474f6-eba3-49be-ae95-2623f31fe374/gLpUmJT
Replit-Helium-Checkpoint-Created: true
</commit_message>
<xml_diff>
--- a/artifacts/api-server/artifacts/api-server/uploads/assets/10/manuscript_6x9.docx
+++ b/artifacts/api-server/artifacts/api-server/uploads/assets/10/manuscript_6x9.docx
@@ -437,14 +437,14 @@
       </w:r>
     </w:p>
     <w:p>
-      <w:bookmarkStart w:id="90777" w:name="chapter_1"/>
+      <w:bookmarkStart w:id="32236" w:name="chapter_1"/>
       <w:pPr>
         <w:pStyle w:val="Heading1"/>
       </w:pPr>
       <w:r>
         <w:t>Session 1: Why Heaven Matters Now</w:t>
       </w:r>
-      <w:bookmarkEnd w:id="90777"/>
+      <w:bookmarkEnd w:id="32236"/>
     </w:p>
     <w:p>
       <w:pPr>
@@ -783,14 +783,14 @@
       </w:r>
     </w:p>
     <w:p>
-      <w:bookmarkStart w:id="49897" w:name="chapter_2"/>
+      <w:bookmarkStart w:id="74553" w:name="chapter_2"/>
       <w:pPr>
         <w:pStyle w:val="Heading1"/>
       </w:pPr>
       <w:r>
         <w:t>Session 2: The Reality and Place of Heaven</w:t>
       </w:r>
-      <w:bookmarkEnd w:id="49897"/>
+      <w:bookmarkEnd w:id="74553"/>
     </w:p>
     <w:p>
       <w:pPr>
@@ -1129,14 +1129,14 @@
       </w:r>
     </w:p>
     <w:p>
-      <w:bookmarkStart w:id="82840" w:name="chapter_3"/>
+      <w:bookmarkStart w:id="17573" w:name="chapter_3"/>
       <w:pPr>
         <w:pStyle w:val="Heading1"/>
       </w:pPr>
       <w:r>
         <w:t>Session 3: Who Goes to Heaven?</w:t>
       </w:r>
-      <w:bookmarkEnd w:id="82840"/>
+      <w:bookmarkEnd w:id="17573"/>
     </w:p>
     <w:p>
       <w:pPr>
@@ -1475,14 +1475,14 @@
       </w:r>
     </w:p>
     <w:p>
-      <w:bookmarkStart w:id="33573" w:name="chapter_4"/>
+      <w:bookmarkStart w:id="25757" w:name="chapter_4"/>
       <w:pPr>
         <w:pStyle w:val="Heading1"/>
       </w:pPr>
       <w:r>
         <w:t>Session 4: What Will We Be Like? Resurrection and Identity</w:t>
       </w:r>
-      <w:bookmarkEnd w:id="33573"/>
+      <w:bookmarkEnd w:id="25757"/>
     </w:p>
     <w:p>
       <w:pPr>
@@ -1821,14 +1821,14 @@
       </w:r>
     </w:p>
     <w:p>
-      <w:bookmarkStart w:id="19467" w:name="chapter_5"/>
+      <w:bookmarkStart w:id="57862" w:name="chapter_5"/>
       <w:pPr>
         <w:pStyle w:val="Heading1"/>
       </w:pPr>
       <w:r>
         <w:t>Session 5: What Will We Do in Heaven? Worship, Work, and Joy</w:t>
       </w:r>
-      <w:bookmarkEnd w:id="19467"/>
+      <w:bookmarkEnd w:id="57862"/>
     </w:p>
     <w:p>
       <w:pPr>
@@ -2167,14 +2167,14 @@
       </w:r>
     </w:p>
     <w:p>
-      <w:bookmarkStart w:id="23177" w:name="chapter_6"/>
+      <w:bookmarkStart w:id="24622" w:name="chapter_6"/>
       <w:pPr>
         <w:pStyle w:val="Heading1"/>
       </w:pPr>
       <w:r>
         <w:t>Session 6: Rewards, Judgment, and Eternal Significance</w:t>
       </w:r>
-      <w:bookmarkEnd w:id="23177"/>
+      <w:bookmarkEnd w:id="24622"/>
     </w:p>
     <w:p>
       <w:pPr>
@@ -2513,14 +2513,14 @@
       </w:r>
     </w:p>
     <w:p>
-      <w:bookmarkStart w:id="66336" w:name="chapter_7"/>
+      <w:bookmarkStart w:id="68264" w:name="chapter_7"/>
       <w:pPr>
         <w:pStyle w:val="Heading1"/>
       </w:pPr>
       <w:r>
         <w:t>Session 7: Heaven and Suffering: Grief, Comfort, and Courage</w:t>
       </w:r>
-      <w:bookmarkEnd w:id="66336"/>
+      <w:bookmarkEnd w:id="68264"/>
     </w:p>
     <w:p>
       <w:pPr>
@@ -2859,14 +2859,14 @@
       </w:r>
     </w:p>
     <w:p>
-      <w:bookmarkStart w:id="94516" w:name="chapter_8"/>
+      <w:bookmarkStart w:id="77835" w:name="chapter_8"/>
       <w:pPr>
         <w:pStyle w:val="Heading1"/>
       </w:pPr>
       <w:r>
         <w:t>Session 8: Living Now in Light of Then</w:t>
       </w:r>
-      <w:bookmarkEnd w:id="94516"/>
+      <w:bookmarkEnd w:id="77835"/>
     </w:p>
     <w:p>
       <w:pPr>

</xml_diff>